<commit_message>
Rett de viktige funnene i A Norway Grasping for Air
Andre runde på den rettede manuskopien: noteapparat uten interne
filnavn, generaliserte levende privatpersoner, kildeland og serier i
kapittel 13, 16 og 19, Mill-forbeholdet, Back-kapitlets datering og
interesseerklæring, titler på kapittel 28 og 38, og Kristus-setninger i
kapittel 29 og 35. Endringsloggen lister det som står igjen.

Co-Authored-By: Claude Fable 5.1 <noreply@anthropic.com>
Claude-Session: https://claude.ai/code/session_01A1E4orMcWa6QWbUAU9n3Zo
</commit_message>
<xml_diff>
--- a/claude/NGA_Complete_Manuscript_rettet_2026-10-18.docx
+++ b/claude/NGA_Complete_Manuscript_rettet_2026-10-18.docx
@@ -485,7 +485,7 @@
       </w:pPr>
       <w:hyperlink w:history="1" w:anchor="kap-28">
         <w:r>
-          <w:t xml:space="preserve">28. Rite Without Formation</w:t>
+          <w:t xml:space="preserve">28. After the Ceremony</w:t>
         </w:r>
       </w:hyperlink>
     </w:p>
@@ -610,7 +610,7 @@
       </w:pPr>
       <w:hyperlink w:history="1" w:anchor="kap-38">
         <w:r>
-          <w:t xml:space="preserve">38. Turn Toward the Father</w:t>
+          <w:t xml:space="preserve">38. Turn Towards the Father</w:t>
         </w:r>
       </w:hyperlink>
     </w:p>
@@ -707,7 +707,7 @@
         <w:ind w:firstLine="260"/>
       </w:pPr>
       <w:r>
-        <w:t xml:space="preserve">Some private history is left untold. That choice limits the claims I can make. It does not give the reader a missing case to reconstruct.</w:t>
+        <w:t>Some private history is left untold. That choice limits the claims I can make. It does not invite the reader to reconstruct what is untold.</w:t>
       </w:r>
     </w:p>
     <w:p>
@@ -730,28 +730,25 @@
         <w:ind w:firstLine="0"/>
       </w:pPr>
       <w:r>
-        <w:t xml:space="preserve">The first drum was borrowed.</w:t>
-      </w:r>
-    </w:p>
-    <w:p>
-      <w:pPr>
-        <w:widowControl/>
-        <w:spacing w:after="40" w:line="320"/>
-        <w:ind w:firstLine="260"/>
-      </w:pPr>
-      <w:r>
-        <w:t xml:space="preserve">I carried it to the ruins of St Mary's Church in Oslo's Medieval Park and stood beside Vannspeilet, the reflecting pool. It was 2024. I wore a long black coat and dark glasses. I had the figure of Neo from </w:t>
+        <w:t>The drum was borrowed.</w:t>
+      </w:r>
+    </w:p>
+    <w:p>
+      <w:pPr>
+        <w:widowControl/>
+        <w:spacing w:after="40" w:line="320"/>
+        <w:ind w:firstLine="260"/>
+      </w:pPr>
+      <w:r>
+        <w:t>I carried it to the ruins of St Mary's Church in Oslo's Medieval Park and stood beside Vannspeilet, the reflecting pool. It was 2024. I wore a long black coat and dark glasses. I had the figure of Neo from The Matrix in mind. I say so because it counts against me, and I will return to it.</w:t>
       </w:r>
       <w:r>
         <w:rPr>
           <w:i/>
           <w:iCs/>
         </w:rPr>
-        <w:t xml:space="preserve">The Matrix</w:t>
-      </w:r>
-      <w:r>
-        <w:t xml:space="preserve"> in mind.</w:t>
-      </w:r>
+      </w:r>
+      <w:r/>
     </w:p>
     <w:p>
       <w:pPr>
@@ -790,7 +787,7 @@
         <w:ind w:firstLine="260"/>
       </w:pPr>
       <w:r>
-        <w:t xml:space="preserve">Beside the ruined church, I struck the drum and cried out. I was calling to God. I asked him to intervene and protect my son. The instrument was borrowed from a friend. My prayer was addressed to Christ.</w:t>
+        <w:t>Beside the ruined church, I struck the drum and cried out. I was calling to God. I prayed for my son. The instrument was borrowed from a friend. My prayer was addressed to Christ.</w:t>
       </w:r>
     </w:p>
     <w:p>
@@ -1656,7 +1653,7 @@
         <w:ind w:firstLine="260"/>
       </w:pPr>
       <w:r>
-        <w:t xml:space="preserve">Years later Michael took me to Germany. It was just the two of us. This was before I returned on my own as an exchange student, before the eleven months in Emsdetten with the Thomitzek family. He had left Germany as a child. Years later I went there in his company.</w:t>
+        <w:t>Years later Michael took me to Germany. It was just the two of us. This was before I returned on my own as an exchange student, before the eleven months in Emsdetten with a host family. He had left Germany as a child. Years later I went there in his company.</w:t>
       </w:r>
       <w:r>
         <w:rPr>
@@ -1718,7 +1715,7 @@
         <w:ind w:firstLine="260"/>
       </w:pPr>
       <w:r>
-        <w:t xml:space="preserve">I am Jewish. I am Norwegian. Neither truth cancels the other.</w:t>
+        <w:t>I am Jewish. I am Norwegian. Neither truth cancels the other. I use the first word by descent, through my mother's father, as the family's own papers record it, and I claim it on no other authority.</w:t>
       </w:r>
     </w:p>
     <w:p>
@@ -1787,17 +1784,17 @@
         <w:ind w:firstLine="260"/>
       </w:pPr>
       <w:r>
-        <w:t xml:space="preserve">Four words in Norwegian, and none of them a wish. There was a sly smile at the corner of his mouth, and he said it the way a man says something he has already checked.</w:t>
-      </w:r>
-    </w:p>
-    <w:p>
-      <w:pPr>
-        <w:widowControl/>
-        <w:spacing w:after="40" w:line="320"/>
-        <w:ind w:firstLine="260"/>
-      </w:pPr>
-      <w:r>
-        <w:t xml:space="preserve">Two of my older cousins were sitting with him. He said it to me, in front of them, and I understood the comparison. Their presence gave the words more weight than they would have carried if he and I had been alone. The sentence stayed with me because of the look, and because he was sure.</w:t>
+        <w:t>Four words in Norwegian, and none of them a wish. There was a sly smile at the corner of his mouth, and he said it, as I heard it, the way a man says something he has already checked.</w:t>
+      </w:r>
+    </w:p>
+    <w:p>
+      <w:pPr>
+        <w:widowControl/>
+        <w:spacing w:after="40" w:line="320"/>
+        <w:ind w:firstLine="260"/>
+      </w:pPr>
+      <w:r>
+        <w:t>Others in the family were sitting with him. He said it to me, in front of them. Their presence gave the words more weight than they would have carried if he and I had been alone. The sentence stayed with me because of the look, and because he seemed sure.</w:t>
       </w:r>
       <w:r>
         <w:rPr>
@@ -1813,7 +1810,7 @@
         <w:ind w:firstLine="260"/>
       </w:pPr>
       <w:r>
-        <w:t xml:space="preserve">He never explained it. He died not long afterwards, and I do not remember how long. Nobody who was there ever mentioned the sentence again. When I asked one of the cousins about it years later, he said he must have pushed it out of his mind.</w:t>
+        <w:t>He never explained it. He died not long afterwards, and I do not remember how long. Nobody who was there ever mentioned the sentence again.</w:t>
       </w:r>
     </w:p>
     <w:p>
@@ -1843,7 +1840,7 @@
         <w:ind w:firstLine="260"/>
       </w:pPr>
       <w:r>
-        <w:t xml:space="preserve">There was a cost to one of those summers apart from the money. I missed the Dana Cup. My coach, Steinar Fondevik, was properly angry, and a couple of parents nearby joined him. Ilmarin took my place. I had taken his in goal at Tangen; in Denmark he took mine, and as far as I know he did the job well. I was glad.</w:t>
+        <w:t>There was a cost to one of those summers apart from the money. I missed the Dana Cup. My coach was properly angry, and a couple of parents nearby joined him. Another keeper took my place. I had taken his in goal at Tangen; in Denmark he took mine, and as far as I know he did the job well. I was glad.</w:t>
       </w:r>
       <w:r>
         <w:rPr>
@@ -1879,7 +1876,7 @@
         <w:ind w:firstLine="260"/>
       </w:pPr>
       <w:r>
-        <w:t xml:space="preserve">He spent money on distance, language and departure. He also sent newspaper cuttings. One concerned the hospital where my mother worked and where I had worked the previous summer. Another concerned supplements. His note urged me to eat sensibly. It reached me in Germany after I had gone there for the exchange year.</w:t>
+        <w:t>He spent money on distance, language and departure. He also sent newspaper cuttings. One concerned the hospital where I had worked the previous summer. Another concerned supplements. His note urged me to eat sensibly. It reached me in Germany after I had gone there for the exchange year.</w:t>
       </w:r>
       <w:r>
         <w:rPr>
@@ -1905,7 +1902,7 @@
         <w:ind w:firstLine="260"/>
       </w:pPr>
       <w:r>
-        <w:t xml:space="preserve">These things do not add up to a complete account of him. He had suffered. The 1947 letter catches one spring of that life and makes no pretence of showing the rest. Nor does my experience as a grandson give me every other member of the family's experience. I received the journeys. His children lived closer to the pain.</w:t>
+        <w:t>These things do not add up to a complete account of him. He had suffered. The 1947 letter catches one spring of that life and makes no pretence of showing the rest. Nor does my experience as a grandson give me every other member of the family's experience. I received the journeys. Others in the family knew him at closer range, and across more years, than a grandson on a trip.</w:t>
       </w:r>
       <w:r>
         <w:rPr>
@@ -1921,7 +1918,7 @@
         <w:ind w:firstLine="260"/>
       </w:pPr>
       <w:r>
-        <w:t xml:space="preserve">I think some of what he was carrying reached them, without his intending to hand it on. That is my understanding of the family. It is not a diagnosis recovered from the letter. Gratitude for what he gave me leaves room for what I could not see as a child.</w:t>
+        <w:t>That is my understanding of the family, not a diagnosis recovered from the letter. Gratitude for what he gave me leaves room for what I could not see as a child.</w:t>
       </w:r>
     </w:p>
     <w:p>
@@ -2050,7 +2047,7 @@
         <w:ind w:firstLine="260"/>
       </w:pPr>
       <w:r>
-        <w:t xml:space="preserve">Near the end, it turned to my younger sister and brother. It said they loved me. When my little brother was born prematurely, I took care of him and carried him around. Michael described it as appearing the most natural thing in the world. Then he moved on to politeness, friends and the prospect that I would fit into a family abroad.</w:t>
+        <w:t>Near the end, it turned to my younger sister and brother. It said they loved me. When my little brother was born, I took care of him and carried him around. Michael described it as appearing the most natural thing in the world. Then he moved on to politeness, friends and the prospect that I would fit into a family abroad.</w:t>
       </w:r>
       <w:r>
         <w:rPr>
@@ -2222,7 +2219,7 @@
         <w:ind w:firstLine="260"/>
       </w:pPr>
       <w:r>
-        <w:t xml:space="preserve">I do not know whether that was all he meant. I know it was part of it.</w:t>
+        <w:t>I do not know whether that was all he meant. I believe it was part of it.</w:t>
       </w:r>
     </w:p>
     <w:p>
@@ -2914,7 +2911,7 @@
         <w:t xml:space="preserve">The Anxious Generation</w:t>
       </w:r>
       <w:r>
-        <w:t xml:space="preserve">, developmental psychologist Candice Odgers challenged Haidt's claim that digital technology had caused an epidemic of teenage mental illness. She pointed to associations that were small or inconsistent, when found at all, and to the difficulty of deciding direction: existing distress may affect online behaviour. Her objection did not amount to approval of every platform practice; she also supported reforms to how platforms treat young users.</w:t>
+        <w:t>, developmental psychologist Candice Odgers challenged Haidt's claim that digital technology had caused an epidemic of teenage mental illness. She pointed to associations that were small or inconsistent, when found at all, and to the difficulty of deciding direction: existing distress may affect online behaviour.</w:t>
       </w:r>
       <w:r>
         <w:rPr>
@@ -3534,7 +3531,7 @@
         <w:ind w:firstLine="260"/>
       </w:pPr>
       <w:r>
-        <w:t xml:space="preserve">Public conduct towards children carries duties of its own. An adult who explains a procedure clearly gives a practical lesson in how strangers can deal with one another. Someone who keeps a promise allows the child to see what reliability looks like. These are ways in which public conduct can be worth imitating.</w:t>
+        <w:t>Public conduct towards children carries duties of its own. An adult who explains a procedure clearly can give a practical lesson in how strangers deal with one another. Someone who keeps a promise can let a child see what reliability looks like. I take these to be ways in which public conduct can be worth imitating; I am not reporting a measured effect.</w:t>
       </w:r>
     </w:p>
     <w:p>
@@ -3684,7 +3681,7 @@
         <w:ind w:firstLine="260"/>
       </w:pPr>
       <w:r>
-        <w:t xml:space="preserve">That continued presence makes the change in membership more interesting than a simple account of disappearance. In the same Statistics Norway membership series, the total fell from 3,522,558 at the end of 2021 to 3,427,657 at the end of 2025. That is 94,901 fewer members, a decrease of about 2.7 per cent over four years.</w:t>
+        <w:t>That continued presence makes the change in membership more interesting than a simple account of disappearance. In Statistics Norway's county table of members, which counts members alone from 2021, the total fell from 3,522,558 at the end of 2021 to 3,427,657 at the end of 2025. That is 94,901 fewer members, a decrease of about 2.7 per cent over four years. The most recent year continued the movement: 3,449,013 at the end of 2024, and 21,356 fewer a year later.</w:t>
       </w:r>
       <w:r>
         <w:rPr>
@@ -3943,7 +3940,7 @@
         <w:ind w:firstLine="260"/>
       </w:pPr>
       <w:r>
-        <w:t xml:space="preserve">Funerals leave a different pattern. In 2025 there were 36,096 Church of Norway funerals, only 701 fewer than in 2015. Their share of deaths fell more markedly, from 90.4 to 80.1 per cent. Between 2024 and 2025, the number of funerals increased by twenty-three while the share fell by 1.4 percentage points.</w:t>
+        <w:t>Funerals leave a different pattern. In 2025 there were 36,096 Church of Norway funerals, 701 fewer than in 2015. Their share of deaths fell more markedly, from 90.4 to 80.1 per cent. Between 2024 and 2025, the number of funerals increased by twenty-three while the share fell by 1.4 percentage points.</w:t>
       </w:r>
       <w:r>
         <w:rPr>
@@ -4289,7 +4286,7 @@
         <w:ind w:firstLine="0"/>
       </w:pPr>
       <w:r>
-        <w:t xml:space="preserve">Between 2000 and 2010, married and cohabiting fathers whose youngest child was under seven increased the time they recorded as household work. The daily average rose from three hours and thirty-seven minutes to four hours and thirty-one minutes. Recorded income-producing work, including work travel and breaks, fell from five hours and thirty-seven minutes to four hours and forty-five minutes.</w:t>
+        <w:t>In Statistics Norway's time-use surveys, between 2000 and 2010, married and cohabiting fathers whose youngest child was under seven increased the time they recorded as household work. The daily average rose from three hours and thirty-seven minutes to four hours and thirty-one minutes. Recorded income-producing work, including work travel and breaks, fell from five hours and thirty-seven minutes to four hours and forty-five minutes.</w:t>
       </w:r>
       <w:r>
         <w:rPr>
@@ -4298,7 +4295,7 @@
         <w:t xml:space="preserve">1</w:t>
       </w:r>
       <w:r>
-        <w:t xml:space="preserve"> A story in which fathers simply withdrew from the work of family life does not fit this part of the record.</w:t>
+        <w:t xml:space="preserve"> The longer series points the same way: fathers with children under fifteen recorded three hours and fifty minutes of household work a day in 2010, one hour and twenty minutes more than at the start of the 1970s, with most of the increase in the final decade. A story in which fathers simply withdrew from the work of family life does not fit this part of the record.</w:t>
       </w:r>
     </w:p>
     <w:p>
@@ -4452,7 +4449,7 @@
         <w:t xml:space="preserve">2</w:t>
       </w:r>
       <w:r>
-        <w:t xml:space="preserve"> A national difference between men and women is not a completed account of the marriage next door.</w:t>
+        <w:t xml:space="preserve"> Across the whole population, Statistics Norway's series from 1971 to 2010 shows women's household work falling by two hours and five minutes a day and men's rising by forty-seven minutes; women still did more. A national difference between men and women is not a completed account of the marriage next door.</w:t>
       </w:r>
     </w:p>
     <w:p>
@@ -5065,7 +5062,7 @@
         <w:ind w:firstLine="260"/>
       </w:pPr>
       <w:r>
-        <w:t xml:space="preserve">The word trust presents a related difficulty. Thomas Dohmen and his colleagues reported associations between parents' and children's attitudes towards risk and trust. Their 2012 article interpreted aspects of the results as supporting socialisation within families.</w:t>
+        <w:t>The word trust presents a related difficulty. Thomas Dohmen and his colleagues, working with German survey data, reported associations between parents' and children's attitudes towards risk and trust. Their 2012 article interpreted aspects of the results as supporting socialisation within families.</w:t>
       </w:r>
       <w:r>
         <w:rPr>
@@ -5084,7 +5081,7 @@
         <w:ind w:firstLine="260"/>
       </w:pPr>
       <w:r>
-        <w:t xml:space="preserve">Christoph Spörlein and colleagues revisited the question with German twin data. Their 2024 study retained parent–child associations, but its modelling gave genetic differences a substantial role in explaining them. Most variation fell in the model's non-shared-environment component, which also includes measurement error. The authors explicitly rejected genetic determinism. Their analysis makes it harder to treat parental resemblance as evidence of one social mechanism.</w:t>
+        <w:t>Christoph Spörlein and colleagues revisited the question with German twin data. Their 2024 study retained parent–child associations, but its modelling gave genetic differences a substantial role in explaining them. Most variation fell in the model's non-shared-environment component, which also includes measurement error. The authors explicitly rejected genetic determinism. They concluded that their findings do not support the socialisation assumption for risk and trust attitudes. Their analysis makes it harder to treat parental resemblance as evidence of one social mechanism.</w:t>
       </w:r>
       <w:r>
         <w:rPr>
@@ -5120,7 +5117,7 @@
         <w:ind w:firstLine="260"/>
       </w:pPr>
       <w:r>
-        <w:t xml:space="preserve">A review by Audrey-Ann Deneault and colleagues combined ninety-three studies, principally from North America and Europe, comparing observed sensitivity in partnered mothers and fathers. It found a small average difference favouring mothers. The difference was not statistically significant in the European samples.</w:t>
+        <w:t>According to its published abstract, a review by Audrey-Ann Deneault and colleagues combined ninety-three studies, principally from North America and Europe, comparing observed sensitivity in partnered mothers and fathers. It found a small average difference favouring mothers. The difference was not statistically significant in the European samples.</w:t>
       </w:r>
       <w:r>
         <w:rPr>
@@ -5240,6 +5237,9 @@
       <w:r>
         <w:t xml:space="preserve">My concern is that a prosperous society may continue to possess goods it has inherited while finding it harder to name and deliberately sustain some of the relationships and practices through which they are learned. I cannot establish that this is happening in Norway. I want to investigate the possibility because the ability to enjoy a good does not, by itself, explain how it reaches another generation.</w:t>
       </w:r>
+      <w:r>
+        <w:t xml:space="preserve"> This is an inference, not a finding.</w:t>
+      </w:r>
     </w:p>
     <w:p>
       <w:pPr>
@@ -5719,7 +5719,7 @@
         <w:ind w:firstLine="260"/>
       </w:pPr>
       <w:r>
-        <w:t xml:space="preserve">The same demand arises in my family's Jewish history. Arie Back describes Yeva opening a home restaurant after Pavel's railway employment ended. In his account, Yeva cooked the food and served it, then washed up. Pavel bought supplies in the markets and helped serve. Arie also recalls visiting while the business was operating. This reaches me through a Norwegian translation of his family account.</w:t>
+        <w:t>The same demand arises in my family's Jewish history. Arie Back describes Yeva opening a home restaurant after her husband Pavel's railway employment ended. In his account, Yeva cooked the food and served it, then washed up. Pavel bought supplies in the markets and helped serve. Arie also recalls visiting while the business was operating. This reaches me through a Norwegian translation of his family account.</w:t>
       </w:r>
       <w:r>
         <w:rPr>
@@ -6254,6 +6254,9 @@
       <w:r>
         <w:t xml:space="preserve">We can acknowledge the effort at the table and still ask whether the boy could speak there. Mill made room for both in his account. I need the same room in mine before extending any claim from a family to a country.</w:t>
       </w:r>
+      <w:r>
+        <w:t xml:space="preserve"> Mill is the mildest case I could have chosen: fear without violence, and a son who still called his childhood happy. I chose him for that reason, so that the claim could be tested where it is hardest to make. The harder cases, of violence and of entrapment, follow in chapter 26.</w:t>
+      </w:r>
     </w:p>
     <w:p>
       <w:pPr>
@@ -6602,7 +6605,7 @@
         <w:ind w:firstLine="260"/>
       </w:pPr>
       <w:r>
-        <w:t xml:space="preserve">Belonging could create another kind of exposure. A government white paper in 2004 considered the experience of krigsbarn, defined there as children born in 1940–1946 to Norwegian mothers and fathers who were soldiers of the German occupying power. Drawing on research, organisations and individual accounts, it recorded reports of bullying by adults as well as children, including accounts involving teachers, health personnel and clergy. It also recognised the burden of feeling compelled to conceal that identity.</w:t>
+        <w:t>Belonging could create another kind of exposure. A government white paper in 2004 considered the experience of krigsbarn, defined there as children born in 1940–1946 to Norwegian mothers and to fathers who were soldiers of the German occupying power. Drawing on research, organisations and individual accounts, it recorded reports of bullying by adults as well as children, including accounts involving teachers, health personnel and clergy. It also recognised the burden of feeling compelled to conceal that identity.</w:t>
       </w:r>
       <w:r>
         <w:rPr>
@@ -6737,7 +6740,7 @@
         <w:ind w:firstLine="0"/>
       </w:pPr>
       <w:r>
-        <w:t xml:space="preserve">In October 2012, the Church of Norway's bishops acknowledged that the church had failed Jews before and during the occupation, and that its protest had come too late. Their statement recalled silence when Jewish identity papers were marked with a J in January 1942 and when Quisling restored the constitutional exclusion of Jews that March. It also recorded a church protest on 10 November.</w:t>
+        <w:t>In October 2012, the Church of Norway's bishops acknowledged that the church had failed Jews during the occupation, and that its protest had come too late. Their statement recalled silence when Jewish identity papers were marked with a J in January 1942 and when Quisling restored the constitutional exclusion of Jews that March. It also recorded a church protest on 10 November.</w:t>
       </w:r>
       <w:r>
         <w:rPr>
@@ -6753,7 +6756,7 @@
         <w:ind w:firstLine="260"/>
       </w:pPr>
       <w:r>
-        <w:t xml:space="preserve">The order matters. A later protest belongs in the history, but cannot take the place of an earlier one that was not made. Neither can a later acknowledgment repair the lost opportunity to act. I am writing about an inheritance in which the ability to speak, and the decision to withhold speech, have to be considered together.</w:t>
+        <w:t>The order matters. A later protest belongs in the history, but cannot take the place of an earlier one that was not made. Neither can a later acknowledgement repair the lost opportunity to act. I am writing about an inheritance in which the ability to speak, and the decision to withhold speech, have to be considered together.</w:t>
       </w:r>
     </w:p>
     <w:p>
@@ -6926,7 +6929,7 @@
       </w:pPr>
       <w:bookmarkStart w:name="kap-28" w:id="1"/>
       <w:r>
-        <w:t xml:space="preserve">28. Rite Without Formation</w:t>
+        <w:t xml:space="preserve">28. After the Ceremony</w:t>
       </w:r>
       <w:bookmarkEnd w:id="1"/>
     </w:p>
@@ -7156,6 +7159,9 @@
       <w:r>
         <w:t>I set this down before I describe anybody else's celebration, because the machinery is mine. A man who has cast himself as a lion is not a neutral witness to a crowd. What follows is a public scene that I enjoyed and wanted to join. I watched it as someone who had already done in private a version of what I am about to describe other people doing in public, and who had already learned how quickly a role can be mistaken for the truth about a person.</w:t>
       </w:r>
+      <w:r>
+        <w:t xml:space="preserve"> The prayer at the ruins was addressed to Christ. The chant on the grass was addressed to a crowd. Keeping those two apart is the discipline of this chapter.</w:t>
+      </w:r>
     </w:p>
     <w:p>
       <w:pPr>
@@ -7423,6 +7429,9 @@
       <w:r>
         <w:t xml:space="preserve">A description can also arrive from outside a person's life. It can reach strangers before they learn much else about him. In my family, one of those descriptions attached itself to Valentin Back, Michael's father. The word was informer. It has a documentary history that can be examined, and the papers do not all assign him the same role.</w:t>
       </w:r>
+      <w:r>
+        <w:t xml:space="preserve"> Valentin Back was my great-grandfather. That gives me an interest in lifting the word from his name, and what follows should be read with that interest in view.</w:t>
+      </w:r>
     </w:p>
     <w:p>
       <w:pPr>
@@ -7646,7 +7655,7 @@
         <w:ind w:firstLine="260"/>
       </w:pPr>
       <w:r>
-        <w:t xml:space="preserve">On 3 October 1938, according to the appeal draft written that day, a military court sentenced Yaakov Kotick to death under the Defence Regulations.</w:t>
+        <w:t>According to an appeal draft dated 3 October 1938, a military court had sentenced Yaakov Kotick to death under the Defence Regulations.</w:t>
       </w:r>
       <w:r>
         <w:rPr>
@@ -7672,7 +7681,7 @@
         <w:ind w:firstLine="260"/>
       </w:pPr>
       <w:r>
-        <w:t xml:space="preserve">Contemporary newspapers in several countries described Valentin Back as an informer, a provocateur, a prosecution witness. The terms varied; the direction did not. Later institutional biographies repeated the identification, and it passed into reference material. </w:t>
+        <w:t xml:space="preserve">Contemporary newspapers described Valentin Back as an informer. The Québec item is the one read for this book; a Tel Aviv paper of the same date has been located but not read. Later institutional biographies repeated the identification, and it passed into reference material. </w:t>
       </w:r>
       <w:r>
         <w:rPr>
@@ -7776,7 +7785,7 @@
         <w:ind w:firstLine="260"/>
       </w:pPr>
       <w:r>
-        <w:t xml:space="preserve">The shared advocacy purpose requires attribution; it does not make the documents false. The formal witness list places Back on the defence side, while the appeal identifies Elagine as the informer. Those findings correct the account of this operation. They cannot provide a verdict on everything Back may have done, and an incomplete personnel search cannot supply one.</w:t>
+        <w:t>The shared advocacy purpose requires attribution; it does not make the documents false. The formal witness list places Back on the defence side, while the appeal identifies Elagine as the informer. Those findings complicate the account of this operation. They cannot provide a verdict on everything Back may have done, and an incomplete personnel search cannot supply one.</w:t>
       </w:r>
     </w:p>
     <w:p>
@@ -7815,7 +7824,7 @@
         <w:t>12</w:t>
       </w:r>
       <w:r>
-        <w:t xml:space="preserve"> The sentence was passed on 3 October 1938; the killing followed in late June 1939, about eight and a half months later.</w:t>
+        <w:t xml:space="preserve"> The sentence had been passed by 3 October 1938; the killing followed in late June 1939, more than eight months later.</w:t>
       </w:r>
     </w:p>
     <w:p>
@@ -8043,6 +8052,12 @@
         <w:rPr>
           <w:vertAlign w:val="superscript"/>
         </w:rPr>
+        <w:t xml:space="preserve">, </w:t>
+      </w:r>
+      <w:r>
+        <w:rPr>
+          <w:vertAlign w:val="superscript"/>
+        </w:rPr>
         <w:t xml:space="preserve">3</w:t>
       </w:r>
     </w:p>
@@ -8112,6 +8127,12 @@
           <w:vertAlign w:val="superscript"/>
         </w:rPr>
         <w:t xml:space="preserve">1</w:t>
+      </w:r>
+      <w:r>
+        <w:rPr>
+          <w:vertAlign w:val="superscript"/>
+        </w:rPr>
+        <w:t xml:space="preserve">, </w:t>
       </w:r>
       <w:r>
         <w:rPr>
@@ -8296,7 +8317,7 @@
         <w:ind w:firstLine="260"/>
       </w:pPr>
       <w:r>
-        <w:t xml:space="preserve">Arie's family account names Yeva as Michael's grandmother and his own. It identifies her brothers, including Meir and Vladimir Grosman. The family drawing places Hava, or Yeva, beneath Eliah and Rachel Grossman and places Michael beneath Valentin. These are direct statements of relationship in the family's own records. They deserve to be read as such.</w:t>
+        <w:t>Arie's family account names Yeva as Michael's grandmother and his own. It identifies her brothers, including Meir and Vladimir Grossman, a name Arie's account spells Grosman. The family drawing places Hava, or Yeva, beneath Eliah and Rachel Grossman and places Michael beneath Valentin. These are direct statements of relationship in the family's own records. They deserve to be read as such.</w:t>
       </w:r>
       <w:r>
         <w:rPr>
@@ -8344,6 +8365,12 @@
         <w:rPr>
           <w:vertAlign w:val="superscript"/>
         </w:rPr>
+        <w:t xml:space="preserve">, </w:t>
+      </w:r>
+      <w:r>
+        <w:rPr>
+          <w:vertAlign w:val="superscript"/>
+        </w:rPr>
         <w:t xml:space="preserve">2</w:t>
       </w:r>
     </w:p>
@@ -8386,6 +8413,12 @@
         <w:rPr>
           <w:vertAlign w:val="superscript"/>
         </w:rPr>
+        <w:t xml:space="preserve">, </w:t>
+      </w:r>
+      <w:r>
+        <w:rPr>
+          <w:vertAlign w:val="superscript"/>
+        </w:rPr>
         <w:t xml:space="preserve">3</w:t>
       </w:r>
     </w:p>
@@ -8418,6 +8451,12 @@
         <w:rPr>
           <w:vertAlign w:val="superscript"/>
         </w:rPr>
+        <w:t xml:space="preserve">, </w:t>
+      </w:r>
+      <w:r>
+        <w:rPr>
+          <w:vertAlign w:val="superscript"/>
+        </w:rPr>
         <w:t xml:space="preserve">2</w:t>
       </w:r>
     </w:p>
@@ -8448,7 +8487,7 @@
         <w:ind w:firstLine="260"/>
       </w:pPr>
       <w:r>
-        <w:t xml:space="preserve">I am Jewish and Norwegian. In writing this history I am giving those words particulars. I am not asking a sequence of admired ancestors to guarantee my character. They cannot do that for me. What they can give me is knowledge of lives I have a reason to attend to, and examples of care I may answer with care of my own.</w:t>
+        <w:t>I am Jewish and Norwegian, by the descent the family's own papers record. In writing this history I am giving those words particulars. I am not asking a sequence of admired ancestors to guarantee my character. They cannot do that for me. What they can give me is knowledge of lives I have a reason to attend to, and examples of care I may answer with care of my own.</w:t>
       </w:r>
     </w:p>
     <w:p>
@@ -8517,7 +8556,7 @@
         <w:ind w:firstLine="260"/>
       </w:pPr>
       <w:r>
-        <w:t xml:space="preserve">I want to keep that distance open. Norway matters to this book because it is the country in which the Solbak Årnes family's story must be told. Its institutions and habits enter the account through particular people: what they were taught, what they were permitted to do, what they passed on. A verdict on the country cannot substitute for those lives. Neither can gratitude for the country decide in advance which parts of them may be spoken about.</w:t>
+        <w:t>I want to keep that distance open. One reason Norway matters to this book is that it is the country in which the Solbak Årnes family's story must be told. Its institutions and habits enter the account through particular people: what they were taught, what they were permitted to do, what they passed on. A verdict on the country cannot substitute for those lives. Neither can gratitude for the country decide in advance which parts of them may be spoken about.</w:t>
       </w:r>
     </w:p>
     <w:p>
@@ -8941,16 +8980,6 @@
         <w:ind w:firstLine="260"/>
       </w:pPr>
       <w:r>
-        <w:t xml:space="preserve">The Jewish history in this book also has to remain the history of particular people. My Christian account of the family is not an instruction to convert the generations on a chart into examples of Christian domestic life. Their own testimony and practices matter. When I speak of what the family owes under Christ, I am stating the responsibility I acknowledge, not putting a confession into an ancestor's mouth.</w:t>
-      </w:r>
-    </w:p>
-    <w:p>
-      <w:pPr>
-        <w:widowControl/>
-        <w:spacing w:after="40" w:line="320"/>
-        <w:ind w:firstLine="260"/>
-      </w:pPr>
-      <w:r>
         <w:t xml:space="preserve">There would be an easier book in which the family appeared only as the thing that other institutions had failed to honour. It could collect every injury and leave every obligation pointing outwards. That is not the book I can justify. Family members can fail one another. They can also tell stories about those failures that protect the teller. A Christian author cannot claim exemption from either possibility.</w:t>
       </w:r>
     </w:p>
@@ -9128,16 +9157,6 @@
         <w:ind w:firstLine="260"/>
       </w:pPr>
       <w:r>
-        <w:t xml:space="preserve">Nor does putting Christ before the family make Jewish belonging an error to be corrected. I am stating whom I acknowledge as Lord. I am not issuing a retrospective instruction that the people in our family record must have understood their lives as I understand mine. Their particularity remains. My responsibility includes telling the truth about it when it complicates a simple account of Norwegian Christianity.</w:t>
-      </w:r>
-    </w:p>
-    <w:p>
-      <w:pPr>
-        <w:widowControl/>
-        <w:spacing w:after="40" w:line="320"/>
-        <w:ind w:firstLine="260"/>
-      </w:pPr>
-      <w:r>
         <w:t xml:space="preserve">Mark's account of Jesus naming those who do God's will as his family has already unsettled the boundary of the household.</w:t>
       </w:r>
       <w:r>
@@ -9188,6 +9207,9 @@
       </w:pPr>
       <w:r>
         <w:t xml:space="preserve">I must decide whether my defence of the family can live under that judgement. If it cannot, the Christian language in it is serving an argument I have already decided to keep regardless of Christ. If it can, reconciliation has to begin somewhere deeper than the restoration of the household I want.</w:t>
+      </w:r>
+      <w:r>
+        <w:t xml:space="preserve"> The one who makes that demand is the same who, at the end of this book, feeds Peter on the shore before he asks anything of him.</w:t>
       </w:r>
     </w:p>
     <w:p>
@@ -9520,7 +9542,7 @@
         <w:ind w:firstLine="260"/>
       </w:pPr>
       <w:r>
-        <w:t xml:space="preserve">Neither can my Christian reading dispossess the Jewish family history that has brought these questions close. Malachi's address to Israel does not become an address to Norway because I read it here. The book's Christian account of fulfilment is mine to state and defend. It is not a confession I may attribute to every Jewish relative, or a condition on which their place in the family depends.</w:t>
+        <w:t xml:space="preserve">Neither can my Christian reading dispossess the Jewish family history that has brought these questions close. Malachi's address to Israel does not become an address to Norway because I read it here. </w:t>
       </w:r>
     </w:p>
     <w:p>
@@ -9570,7 +9592,7 @@
         <w:ind w:firstLine="260"/>
       </w:pPr>
       <w:r>
-        <w:t xml:space="preserve">Malachi's final words warn of complete destruction. I must not remove that warning because it makes the promise less comfortable. It belongs to God's address. I have no warrant to turn it into a forecast of Norway's future or a threat attached to a reader's decision about contact. Social statistics cannot tell me when God will punish a country.</w:t>
+        <w:t>Malachi's final words warn of complete destruction. I must not remove that warning because it makes the promise less comfortable. It belongs to God's address. I have no warrant to turn it into a forecast of Norway's future or a threat attached to a reader's decision about contact. Social statistics cannot tell me whether God will punish a country, or when.</w:t>
       </w:r>
     </w:p>
     <w:p>
@@ -9622,7 +9644,7 @@
       </w:pPr>
       <w:bookmarkStart w:name="kap-38" w:id="1"/>
       <w:r>
-        <w:t xml:space="preserve">38. Turn Toward the Father</w:t>
+        <w:t xml:space="preserve">38. Turn Towards the Father</w:t>
       </w:r>
       <w:bookmarkEnd w:id="1"/>
     </w:p>
@@ -9781,7 +9803,7 @@
         <w:ind w:firstLine="260"/>
       </w:pPr>
       <w:r>
-        <w:t xml:space="preserve">There can also be a wrong done by the son which needs acknowledgment. The father's failures do not automatically explain away everything the son has done. But the reverse is equally true: a son's wrongdoing does not excuse everything done to him. A truthful account need not distribute blame evenly. It needs to identify responsibility where responsibility belongs.</w:t>
+        <w:t>There can also be a wrong done by the son which needs acknowledgement. The father's failures do not automatically explain away everything the son has done. But the reverse is equally true: a son's wrongdoing does not excuse everything done to him. A truthful account need not distribute blame evenly. It needs to identify responsibility where responsibility belongs.</w:t>
       </w:r>
     </w:p>
     <w:p>
@@ -9952,7 +9974,7 @@
         <w:ind w:firstLine="260"/>
       </w:pPr>
       <w:r>
-        <w:t xml:space="preserve">There is also a false peace which depends upon nobody naming what happened. It can resemble reconciliation from outside because the argument has stopped. If the cost is continued harm or an enforced false account, its quietness cannot settle the question. The instruction to live at peace belongs beside Paul's demand for love without hypocrisy and his rejection of evil.</w:t>
+        <w:t>There is also a false peace which depends upon nobody naming what happened. It can resemble reconciliation from outside because the argument has stopped. If the cost is continued harm or an enforced false account, its quietness cannot settle the question. The instruction to live at peace belongs beside Paul's demand for sincere love and his rejection of evil.</w:t>
       </w:r>
       <w:r>
         <w:rPr>
@@ -10175,7 +10197,7 @@
         <w:ind w:firstLine="260"/>
       </w:pPr>
       <w:r>
-        <w:t xml:space="preserve">The family history recovered for this book carries names as well as practices. The Back and Grosman records belong within the account of the Solbak Årnes family's Jewish inheritance. They deserve truthful preservation because these people lived, and because their relationships are part of the family's history. Their worth does not depend upon how useful they become to my argument about Norway.</w:t>
+        <w:t>The family history recovered for this book carries names as well as practices. The Back and Grossman records belong within the account of the Solbak Årnes family's Jewish inheritance. They deserve truthful preservation because these people lived, and because their relationships are part of the family's history. Their worth does not depend upon how useful they become to my argument about Norway.</w:t>
       </w:r>
     </w:p>
     <w:p>
@@ -10357,17 +10379,17 @@
         <w:ind w:firstLine="260"/>
       </w:pPr>
       <w:r>
-        <w:t xml:space="preserve">During the week, there are other routines. I read with my daughter Sunniva before she goes to bed. We sing before and after meals. I take our dog Elisja for walks. These are parts of our ordinary life, repeated on different days.</w:t>
-      </w:r>
-    </w:p>
-    <w:p>
-      <w:pPr>
-        <w:widowControl/>
-        <w:spacing w:after="40" w:line="320"/>
-        <w:ind w:firstLine="260"/>
-      </w:pPr>
-      <w:r>
-        <w:t xml:space="preserve">The family history in this book reaches much further back than any of those acts. It gives me names I can pass on to Sunniva and accounts whose tellers I can name. Hilmar's work in the boat belongs to my memory. Arie's memories of Yeva and Pavel reach me through his writing. Michael's part in the family belongs to both lived memory and the papers he left behind. I can keep the difference clear when I tell the stories.</w:t>
+        <w:t>During the week, there are other routines. I read with my daughter before she goes to bed. We sing before and after meals. I take our dog Elisja for walks. These are parts of our ordinary life, repeated on different days.</w:t>
+      </w:r>
+    </w:p>
+    <w:p>
+      <w:pPr>
+        <w:widowControl/>
+        <w:spacing w:after="40" w:line="320"/>
+        <w:ind w:firstLine="260"/>
+      </w:pPr>
+      <w:r>
+        <w:t>The family history in this book reaches much further back than any of those acts. It gives me names I can pass on to my daughter and accounts whose tellers I can name. Hilmar's work in the boat belongs to my memory. Arie's memories of Yeva and Pavel reach me through his writing. Michael's part in the family belongs to both lived memory and the papers he left behind. I can keep the difference clear when I tell the stories.</w:t>
       </w:r>
     </w:p>
     <w:p>
@@ -10422,17 +10444,16 @@
         </w:rPr>
       </w:pPr>
       <w:r>
-        <w:t xml:space="preserve">1. Author's account in </w:t>
+        <w:t>1. Author's own written account of the scene, held in the family collection,</w:t>
       </w:r>
       <w:r>
         <w:rPr>
           <w:i/>
           <w:iCs/>
         </w:rPr>
-        <w:t xml:space="preserve">RO Voice Pilot 03</w:t>
-      </w:r>
-      <w:r>
-        <w:t xml:space="preserve">, v0.2, limited to the borrowed drum, the 2024 location, clothing, prayer and return home; use of the scene approved and narrowed by the author on 6 September 2026. The private dispute and its allegations are excluded. This passage does not establish another person's thoughts or the effects of the prayer.</w:t>
+      </w:r>
+      <w:r>
+        <w:t xml:space="preserve"> limited to the borrowed drum, the 2024 location, clothing, prayer and return home; use of the scene approved and narrowed by the author on 6 September 2026. The private dispute and its allegations are excluded. This passage does not establish another person's thoughts or the effects of the prayer.</w:t>
       </w:r>
     </w:p>
     <w:p>
@@ -10445,27 +10466,23 @@
         </w:rPr>
       </w:pPr>
       <w:r>
-        <w:t xml:space="preserve">2. Hilmar memory: author's recorded childhood account, preserved in </w:t>
+        <w:t>2. Hilmar memory: author's recorded childhood account, preserved in his own written accounts in the family collection;</w:t>
       </w:r>
       <w:r>
         <w:rPr>
           <w:i/>
           <w:iCs/>
         </w:rPr>
-        <w:t xml:space="preserve">RO Toneprint Rewrite Batch A</w:t>
-      </w:r>
-      <w:r>
-        <w:t xml:space="preserve">, v0.2.1, and </w:t>
-      </w:r>
+      </w:r>
+      <w:r/>
       <w:r>
         <w:rPr>
           <w:i/>
           <w:iCs/>
         </w:rPr>
-        <w:t xml:space="preserve">RO Voice Pilot 03</w:t>
-      </w:r>
-      <w:r>
-        <w:t xml:space="preserve">, v0.2; see chapters 1–3. No particular day's fishing sequence is reconstructed.</w:t>
+      </w:r>
+      <w:r>
+        <w:t xml:space="preserve"> see chapters 1–3. No particular day's fishing sequence is reconstructed.</w:t>
       </w:r>
     </w:p>
     <w:p>
@@ -10488,17 +10505,16 @@
         </w:rPr>
       </w:pPr>
       <w:r>
-        <w:t xml:space="preserve">1. Author's recorded childhood memories, preserved in </w:t>
+        <w:t>1. Author's recorded childhood memories, preserved in his own written account in the family collection;</w:t>
       </w:r>
       <w:r>
         <w:rPr>
           <w:i/>
           <w:iCs/>
         </w:rPr>
-        <w:t xml:space="preserve">RO Toneprint Rewrite Batch A</w:t>
-      </w:r>
-      <w:r>
-        <w:t xml:space="preserve">, v0.2.1, former chapter 2, “The Real Boat”; family use confirmed by the author, 6 September 2026. The fishing location is Bunnefjorden, not Sæterelva. No particular day's sequence or dialogue is reconstructed here.</w:t>
+      </w:r>
+      <w:r>
+        <w:t xml:space="preserve"> family use confirmed by the author, 6 September 2026. The fishing location is Bunnefjorden, not Sæterelva. No particular day's sequence or dialogue is reconstructed here.</w:t>
       </w:r>
     </w:p>
     <w:p>
@@ -10518,20 +10534,17 @@
           <w:i/>
           <w:iCs/>
         </w:rPr>
-        <w:t xml:space="preserve">Author Interview Record 0019</w:t>
-      </w:r>
-      <w:r>
-        <w:t xml:space="preserve">, v0.2. Name, date and subsequent corrections checked against </w:t>
-      </w:r>
+        <w:t>recording and transcript in the family collection. Name, date and subsequent corrections checked against the family's review of the interview.</w:t>
+      </w:r>
+      <w:r/>
       <w:r>
         <w:rPr>
           <w:i/>
           <w:iCs/>
         </w:rPr>
-        <w:t xml:space="preserve">Result 0020B</w:t>
-      </w:r>
-      <w:r>
-        <w:t xml:space="preserve">, v0.3. Interview statements are Hilmar's recollections.</w:t>
+      </w:r>
+      <w:r>
+        <w:t xml:space="preserve"> Interview statements are Hilmar's recollections.</w:t>
       </w:r>
     </w:p>
     <w:p>
@@ -10561,10 +10574,10 @@
           <w:i/>
           <w:iCs/>
         </w:rPr>
-        <w:t xml:space="preserve">Author Interview Record 0019</w:t>
-      </w:r>
-      <w:r>
-        <w:t xml:space="preserve">, v0.2. The differing hook and tub counts are deliberately not resolved.</w:t>
+        <w:t>recording and transcript in the family collection.</w:t>
+      </w:r>
+      <w:r>
+        <w:t xml:space="preserve"> The differing hook and tub counts are deliberately not resolved.</w:t>
       </w:r>
     </w:p>
     <w:p>
@@ -10610,10 +10623,10 @@
           <w:i/>
           <w:iCs/>
         </w:rPr>
-        <w:t xml:space="preserve">Result 0020B: Hilmar Interview Final Source Audit</w:t>
-      </w:r>
-      <w:r>
-        <w:t xml:space="preserve">, v0.3, F26, F30 and F34. Tor's authorship of the memorial garment is family-confirmed. Its vessel list is not treated as a complete or independently verified chronology.</w:t>
+        <w:t>The family's review of the Hilmar interview, items F26, F30 and F34, family collection.</w:t>
+      </w:r>
+      <w:r>
+        <w:t xml:space="preserve"> Tor's authorship of the memorial garment is family-confirmed. Its vessel list is not treated as a complete or independently verified chronology.</w:t>
       </w:r>
     </w:p>
     <w:p>
@@ -10643,10 +10656,10 @@
           <w:i/>
           <w:iCs/>
         </w:rPr>
-        <w:t xml:space="preserve">Author Interview Record 0019</w:t>
-      </w:r>
-      <w:r>
-        <w:t xml:space="preserve">, v0.2. In English: “You were enjoying rowing and whistling and singing. And I was enjoying being with you.” Hilmar's subsequent account of a larger fishing vessel is not assigned to the child's rowing boat.</w:t>
+        <w:t>recording and transcript in the family collection.</w:t>
+      </w:r>
+      <w:r>
+        <w:t xml:space="preserve"> In English: “You were enjoying rowing and whistling and singing. And I was enjoying being with you.” Hilmar's subsequent account of a larger fishing vessel is not assigned to the child's rowing boat.</w:t>
       </w:r>
     </w:p>
     <w:p>
@@ -10659,17 +10672,16 @@
         </w:rPr>
       </w:pPr>
       <w:r>
-        <w:t xml:space="preserve">2. The whistling and the child's all-clear interpretation are preserved in </w:t>
+        <w:t>2. The whistling and the child's all-clear interpretation are preserved in the author's own written account in the family collection.</w:t>
       </w:r>
       <w:r>
         <w:rPr>
           <w:i/>
           <w:iCs/>
         </w:rPr>
-        <w:t xml:space="preserve">RO Toneprint Rewrite Batch A</w:t>
-      </w:r>
-      <w:r>
-        <w:t xml:space="preserve">, v0.2.1, former chapter 2. The tune, weather and exact dates of individual trips are not reconstructed.</w:t>
+      </w:r>
+      <w:r>
+        <w:t xml:space="preserve"> The tune, weather and exact dates of individual trips are not reconstructed.</w:t>
       </w:r>
     </w:p>
     <w:p>
@@ -10702,17 +10714,16 @@
         <w:t xml:space="preserve">Jewish ancestery.pdf</w:t>
       </w:r>
       <w:r>
-        <w:t xml:space="preserve">, PDF pp. 7–8. Both original pages visually checked on 6 September 2026 against </w:t>
+        <w:t>, PDF pp. 7–8. Both original pages visually checked on 6 September 2026 against the transcription and translation held in the family collection.</w:t>
       </w:r>
       <w:r>
         <w:rPr>
           <w:i/>
           <w:iCs/>
         </w:rPr>
-        <w:t xml:space="preserve">RO Source Audit 11</w:t>
-      </w:r>
-      <w:r>
-        <w:t xml:space="preserve">, v0.4, transcription and translation. The letter is Gerda's contemporary account; no reply or community decision is claimed. The three camp contexts and the concentration-camp duration are kept distinct. No identification of the uncle beyond the relationship stated in the letter is required here.</w:t>
+      </w:r>
+      <w:r>
+        <w:t xml:space="preserve"> The letter is Gerda's contemporary account; no reply or community decision is claimed. The three camp contexts and the concentration-camp duration are kept distinct. No identification of the uncle beyond the relationship stated in the letter is required here.</w:t>
       </w:r>
     </w:p>
     <w:p>
@@ -10725,27 +10736,26 @@
         </w:rPr>
       </w:pPr>
       <w:r>
-        <w:t xml:space="preserve">2. Author-confirmed memories preserved in </w:t>
+        <w:t>2. Author-confirmed memories preserved in his own written account, family collection.</w:t>
       </w:r>
       <w:r>
         <w:rPr>
           <w:i/>
           <w:iCs/>
         </w:rPr>
-        <w:t xml:space="preserve">RO Voice Pilot 02: You've Made It</w:t>
-      </w:r>
-      <w:r>
-        <w:t xml:space="preserve">, v0.5.1. England/France dates are also in the original 2004 Parents' Letter, </w:t>
+      </w:r>
+      <w:r>
+        <w:t xml:space="preserve"> England/France dates are also in the original 2004 Parents' Letter, </w:t>
       </w:r>
       <w:r>
         <w:rPr>
           <w:i/>
           <w:iCs/>
         </w:rPr>
-        <w:t xml:space="preserve">RO Source Audit 12</w:t>
-      </w:r>
-      <w:r>
-        <w:t xml:space="preserve">, item A4. The eleven-month exchange and host family are covered by the controlled exchange file; no travel scene or dialogue is reconstructed.</w:t>
+        <w:t>the family-document file, item A4, family collection.</w:t>
+      </w:r>
+      <w:r>
+        <w:t xml:space="preserve"> The eleven-month exchange and host family are covered by the controlled exchange file; no travel scene or dialogue is reconstructed.</w:t>
       </w:r>
     </w:p>
     <w:p>
@@ -10781,27 +10791,23 @@
         </w:rPr>
       </w:pPr>
       <w:r>
-        <w:t xml:space="preserve">1. Author-confirmed memory and interpretation in </w:t>
+        <w:t>1. Author-confirmed memory and interpretation, recorded in his own written account and the family-document review, family collection.</w:t>
       </w:r>
       <w:r>
         <w:rPr>
           <w:i/>
           <w:iCs/>
         </w:rPr>
-        <w:t xml:space="preserve">RO Voice Pilot 02: You've Made It</w:t>
-      </w:r>
-      <w:r>
-        <w:t xml:space="preserve">, v0.5.1, and its ratification in </w:t>
-      </w:r>
+      </w:r>
+      <w:r/>
       <w:r>
         <w:rPr>
           <w:i/>
           <w:iCs/>
         </w:rPr>
-        <w:t xml:space="preserve">RO Source Audit 11</w:t>
-      </w:r>
-      <w:r>
-        <w:t xml:space="preserve">, v0.4. The remembered sentence is present tense: “Du har klart det”, not “Du hadde klart det”. Its location and the interval to Michael's death remain unspecified. Cousins remain unnamed and receive no attributed defect or motive. The Dana Cup country/year is not newly assigned.</w:t>
+      </w:r>
+      <w:r>
+        <w:t xml:space="preserve"> The remembered sentence is present tense: “Du har klart det”, not “Du hadde klart det”. Its location and the interval to Michael's death remain unspecified. Relatives present remain unnamed and receive no attributed defect or motive. The Dana Cup country/year is not newly assigned.</w:t>
       </w:r>
     </w:p>
     <w:p>
@@ -10821,10 +10827,10 @@
           <w:i/>
           <w:iCs/>
         </w:rPr>
-        <w:t xml:space="preserve">RO Source Audit 12</w:t>
-      </w:r>
-      <w:r>
-        <w:t xml:space="preserve">, v0.7, items A9–A10: original newspaper cuttings with handwritten notes. Authorship and “Bestefar i Lia” are author-confirmed. The present chapter paraphrases the controlled record; the originals are not reproduced here.</w:t>
+        <w:t>Family-document file, items A9–A10, family collection:</w:t>
+      </w:r>
+      <w:r>
+        <w:t xml:space="preserve"> original newspaper cuttings with handwritten notes. Authorship and “Bestefar i Lia” are author-confirmed. The present chapter paraphrases the controlled record; the originals are not reproduced here.</w:t>
       </w:r>
     </w:p>
     <w:p>
@@ -10864,10 +10870,10 @@
           <w:i/>
           <w:iCs/>
         </w:rPr>
-        <w:t xml:space="preserve">RO Source Audit 12</w:t>
-      </w:r>
-      <w:r>
-        <w:t xml:space="preserve">, item A4. Original visually checked 6 September 2026. The heading, lack of signature and parental first-person voice do not identify the drafter; Michael's authorship is author-confirmed memory. The page records the brother's prematurity, but the medical interval and living relatives' ages are not needed here. “As if it were my own child” is not in the document and is not used.</w:t>
+        <w:t>the family-document file, item A4, family collection.</w:t>
+      </w:r>
+      <w:r>
+        <w:t xml:space="preserve"> Original visually checked 6 September 2026. The heading, lack of signature and parental first-person voice do not identify the drafter; Michael's authorship is author-confirmed memory. The page records details of the brother's birth that are not needed here. “As if it were my own child” is not in the document and is not used.</w:t>
       </w:r>
     </w:p>
     <w:p>
@@ -10887,10 +10893,10 @@
           <w:i/>
           <w:iCs/>
         </w:rPr>
-        <w:t xml:space="preserve">RO Source Audit 12</w:t>
-      </w:r>
-      <w:r>
-        <w:t xml:space="preserve">, item A5. Original visually checked 6 September 2026. The free-training benefit is explicitly recorded. Assistance at a hospital internet café is not represented as clinical care.</w:t>
+        <w:t>the family-document file, item A5, family collection.</w:t>
+      </w:r>
+      <w:r>
+        <w:t xml:space="preserve"> Original visually checked 6 September 2026. The free-training benefit is explicitly recorded. Assistance at a hospital internet café is not represented as clinical care.</w:t>
       </w:r>
     </w:p>
     <w:p>
@@ -10903,17 +10909,16 @@
         </w:rPr>
       </w:pPr>
       <w:r>
-        <w:t xml:space="preserve">3. The closing interpretation and its express limit were ratified in </w:t>
+        <w:t>3. The closing interpretation and its express limit are recorded in the author's own written account, family collection.</w:t>
       </w:r>
       <w:r>
         <w:rPr>
           <w:i/>
           <w:iCs/>
         </w:rPr>
-        <w:t xml:space="preserve">RO Voice Pilot 02: You've Made It</w:t>
-      </w:r>
-      <w:r>
-        <w:t xml:space="preserve">, v0.5.1. They remain the author's interpretation, supported by the contemporary documents, not an external assessment of his later fatherhood.</w:t>
+      </w:r>
+      <w:r>
+        <w:t xml:space="preserve"> They remain the author's interpretation, supported by the contemporary documents, not an external assessment of his later fatherhood.</w:t>
       </w:r>
     </w:p>
     <w:p>
@@ -10936,17 +10941,16 @@
         </w:rPr>
       </w:pPr>
       <w:r>
-        <w:t xml:space="preserve">1. Author-approved scope and wording, </w:t>
+        <w:t>1. Author-approved scope and wording, under the author's own standing ruling on this subject.</w:t>
       </w:r>
       <w:r>
         <w:rPr>
           <w:i/>
           <w:iCs/>
         </w:rPr>
-        <w:t xml:space="preserve">NGA Book Constitution 02</w:t>
-      </w:r>
-      <w:r>
-        <w:t xml:space="preserve">, v2.3, §H.15. No cause, person, institution, procedure, date or identifying detail concerning the loss of contact is added. The chapter's distinctions are moral and conceptual; no prevalence, diagnosis or causal estimate is claimed.</w:t>
+      </w:r>
+      <w:r>
+        <w:t xml:space="preserve"> No cause, person, institution, procedure, date or identifying detail concerning the loss of contact is added. The chapter's distinctions are moral and conceptual; no prevalence, diagnosis or causal estimate is claimed.</w:t>
       </w:r>
       <w:r>
         <w:t xml:space="preserve"> The approved wording is printed in full, as in the Prologue.</w:t>
@@ -10979,20 +10983,17 @@
           <w:i/>
           <w:iCs/>
         </w:rPr>
-        <w:t xml:space="preserve">Author Interview Record 0019</w:t>
-      </w:r>
-      <w:r>
-        <w:t xml:space="preserve">, v0.2; see chapter 2. The present chapter develops the reciprocal question adopted in </w:t>
-      </w:r>
+        <w:t>recording and transcript in the family collection; see chapter 2. The present chapter develops the reciprocal question adopted for this book.</w:t>
+      </w:r>
+      <w:r/>
       <w:r>
         <w:rPr>
           <w:i/>
           <w:iCs/>
         </w:rPr>
-        <w:t xml:space="preserve">NGA Book Constitution 02</w:t>
-      </w:r>
-      <w:r>
-        <w:t xml:space="preserve">, §§I.2, I.7–I.10. It reports no population effect and gives no instruction to resume unsafe contact. Evidence about digital use is examined in chapters 9–10.</w:t>
+      </w:r>
+      <w:r>
+        <w:t xml:space="preserve"> It reports no population effect and gives no instruction to resume unsafe contact. Evidence about digital use is examined in chapters 9–10.</w:t>
       </w:r>
     </w:p>
     <w:p>
@@ -11060,17 +11061,16 @@
         </w:r>
       </w:hyperlink>
       <w:r>
-        <w:t xml:space="preserve">. Attribution of the thesis, not endorsement of its causal reach. The dispute is examined in chapter 10. The account of the conversation with Hilmar rests on </w:t>
+        <w:t>. Attribution of the thesis, not endorsement of its causal reach. The dispute is examined in chapter 10. The account of the conversation with Hilmar rests on the recorded interview of 30 July 2026, family collection;</w:t>
       </w:r>
       <w:r>
         <w:rPr>
           <w:i/>
           <w:iCs/>
         </w:rPr>
-        <w:t xml:space="preserve">Author Interview Record 0019</w:t>
-      </w:r>
-      <w:r>
-        <w:t xml:space="preserve">, 30 July 2026; see chapters 1–3.</w:t>
+      </w:r>
+      <w:r>
+        <w:t xml:space="preserve"> see chapters 1–3.</w:t>
       </w:r>
     </w:p>
     <w:p>
@@ -11714,6 +11714,9 @@
       <w:r>
         <w:t xml:space="preserve">. Neither the stock change nor the definition change supplies a count of altered beliefs or household practices.</w:t>
       </w:r>
+      <w:r>
+        <w:t xml:space="preserve"> The total rows for 2024 and 2025 give 3,449,013 and 3,427,657; table read 18 October 2026.</w:t>
+      </w:r>
     </w:p>
     <w:p>
       <w:pPr>
@@ -12063,6 +12066,9 @@
       <w:r>
         <w:t xml:space="preserve">, Statistics Norway, Reports 44/2013, table 4.4, printed p. 27; housework detail in tables 3.7–3.8, p. 22. Married/cohabiting fathers, youngest child aged 0–6; daily averages for the specified groups, including days with none of the activity. Childcare is the main activity. The comparison is not a longitudinal account of the same fathers.</w:t>
       </w:r>
+      <w:r>
+        <w:t xml:space="preserve"> The same report states that fathers with children under fifteen spent three hours and fifty minutes a day on household work in 2010, one hour and twenty minutes more than at the start of the 1970s, with the increase concentrated in the last decade (Statistics Norway summary of the report, 15 October 2013).</w:t>
+      </w:r>
     </w:p>
     <w:p>
       <w:pPr>
@@ -12087,6 +12093,9 @@
       <w:r>
         <w:t xml:space="preserve">, 19 December 2024, corrected 8 August 2025; family-stage definition and discussion around figures 1–2. Analysis age: 18–66. Couples include married/cohabiting people living with children, including stepchildren and adopted children. Work figures in the body compare groups within 2022; they are not joined to the earlier report as an uninterrupted series. The source states that both partners' diaries were not collected within each couple.</w:t>
       </w:r>
+      <w:r>
+        <w:t xml:space="preserve"> For the whole population, 1971 to 2010: Statistics Norway, Tidene skifter: Tidsbruk 1971–2010, Statistiske analyser 125, 2 January 2012: men 47 minutes more household work per day in 2010 than in 1971; women 2 hours and 5 minutes less.</w:t>
+      </w:r>
     </w:p>
     <w:p>
       <w:pPr>
@@ -13172,7 +13181,7 @@
         </w:r>
       </w:hyperlink>
       <w:r>
-        <w:t xml:space="preserve">, BM 037/12, pp.12–14, decision and statement on the church's relationship with Jews during the occupation. Primary evidence for the bishops' 2012 acknowledgment; its account of wartime events is retrospective.</w:t>
+        <w:t>, BM 037/12, pp.12–14, decision and statement on the church's relationship with Jews during the occupation. Primary evidence for the bishops' 2012 acknowledgement; its account of wartime events is retrospective.</w:t>
       </w:r>
     </w:p>
     <w:p>
@@ -13206,7 +13215,7 @@
         <w:spacing w:after="200" w:before="300"/>
       </w:pPr>
       <w:r>
-        <w:t xml:space="preserve">28. Rite Without Formation</w:t>
+        <w:t xml:space="preserve">28. After the Ceremony</w:t>
       </w:r>
     </w:p>
     <w:p>
@@ -13738,38 +13747,29 @@
         </w:rPr>
       </w:pPr>
       <w:r>
-        <w:t xml:space="preserve">2. Hilmar material: </w:t>
+        <w:t>2. Hilmar material: the recorded interview of 30 July 2026 and the family's review of it, family collection; chapters 1–3. Michael's journeys and the author's memories: the author's own written account, family collection; chapters 4–6.</w:t>
       </w:r>
       <w:r>
         <w:rPr>
           <w:i/>
           <w:iCs/>
         </w:rPr>
-        <w:t xml:space="preserve">Author Interview Record 0019</w:t>
-      </w:r>
-      <w:r>
-        <w:t xml:space="preserve">, v0.2, and </w:t>
-      </w:r>
+      </w:r>
+      <w:r/>
       <w:r>
         <w:rPr>
           <w:i/>
           <w:iCs/>
         </w:rPr>
-        <w:t xml:space="preserve">Result 0020B</w:t>
-      </w:r>
-      <w:r>
-        <w:t xml:space="preserve">, v0.3; chapters 1–3. Michael's journeys and the author's memories: </w:t>
-      </w:r>
+      </w:r>
+      <w:r/>
       <w:r>
         <w:rPr>
           <w:i/>
           <w:iCs/>
         </w:rPr>
-        <w:t xml:space="preserve">RO Voice Pilot 02</w:t>
-      </w:r>
-      <w:r>
-        <w:t xml:space="preserve">, v0.5.1; chapters 4–6.</w:t>
-      </w:r>
+      </w:r>
+      <w:r/>
     </w:p>
     <w:p>
       <w:pPr>
@@ -14292,7 +14292,7 @@
         <w:spacing w:after="200" w:before="300"/>
       </w:pPr>
       <w:r>
-        <w:t xml:space="preserve">38. Turn Toward the Father</w:t>
+        <w:t xml:space="preserve">38. Turn Towards the Father</w:t>
       </w:r>
     </w:p>
     <w:p>
@@ -14516,7 +14516,7 @@
         </w:rPr>
       </w:pPr>
       <w:r>
-        <w:t xml:space="preserve">1. Author's direct description, 6 September 2026: Sunday Communion, living-room setting, usual participants, Jesus Prayer, Maria's bread research, wine, reading with Sunniva, songs before and after meals, walks with Elisja. The account describes recurring practice rather than one reconstructed occasion. No particular wording of the Jesus Prayer, recipe ingredients, book title or song text is supplied. The bread is described as the family's adaptation, not as a verified ancient recipe.</w:t>
+        <w:t>1. Author's direct description, 6 September 2026: Sunday Communion, living-room setting, usual participants, Jesus Prayer, Maria's bread research, wine, reading with the author's daughter, songs before and after meals, walks with Elisja. The account describes recurring practice rather than one reconstructed occasion. No particular wording of the Jesus Prayer, recipe ingredients, book title or song text is supplied. The bread is described as the family's adaptation, not as a verified ancient recipe.</w:t>
       </w:r>
       <w:r>
         <w:t xml:space="preserve"> The sentence about the author's son repeats the approved wording of the Prologue and Chapter 7 and adds no new detail. The closing reference to Christ follows John 21, as in Chapter 40.</w:t>

</xml_diff>